<commit_message>
building up paper code
</commit_message>
<xml_diff>
--- a/analyses/paper/submission_materials/Manuscript.docx
+++ b/analyses/paper/submission_materials/Manuscript.docx
@@ -458,24 +458,35 @@
       </w:r>
       <w:bookmarkEnd w:id="0"/>
       <w:r>
-        <w:t xml:space="preserve"> and </w:t>
+        <w:t xml:space="preserve"> </w:t>
+      </w:r>
+      <w:proofErr w:type="gramStart"/>
+      <w:r>
+        <w:t xml:space="preserve">and </w:t>
       </w:r>
       <w:r>
         <w:rPr>
           <w:highlight w:val="yellow"/>
         </w:rPr>
-        <w:t xml:space="preserve">2.54 </w:t>
+        <w:t xml:space="preserve"> </w:t>
       </w:r>
       <w:r>
         <w:rPr>
           <w:highlight w:val="yellow"/>
         </w:rPr>
-        <w:t xml:space="preserve">1.91 </w:t>
-      </w:r>
+        <w:t>1.91</w:t>
+      </w:r>
+      <w:proofErr w:type="gramEnd"/>
       <w:r>
         <w:rPr>
           <w:highlight w:val="yellow"/>
         </w:rPr>
+        <w:t xml:space="preserve"> </w:t>
+      </w:r>
+      <w:r>
+        <w:rPr>
+          <w:highlight w:val="yellow"/>
+        </w:rPr>
         <w:t>million (1.33-3.55)</w:t>
       </w:r>
       <w:r>
@@ -506,96 +517,72 @@
         <w:rPr>
           <w:highlight w:val="yellow"/>
         </w:rPr>
-        <w:t>4.26</w:t>
-      </w:r>
+        <w:t>3.8</w:t>
+      </w:r>
+      <w:proofErr w:type="gramStart"/>
       <w:r>
         <w:rPr>
           <w:highlight w:val="yellow"/>
         </w:rPr>
-        <w:t>%</w:t>
+        <w:t xml:space="preserve">% </w:t>
       </w:r>
       <w:r>
         <w:rPr>
           <w:highlight w:val="yellow"/>
         </w:rPr>
-        <w:t xml:space="preserve"> 3.8</w:t>
-      </w:r>
-      <w:proofErr w:type="gramStart"/>
+        <w:t xml:space="preserve"> (</w:t>
+      </w:r>
+      <w:proofErr w:type="gramEnd"/>
       <w:r>
         <w:rPr>
           <w:highlight w:val="yellow"/>
         </w:rPr>
-        <w:t xml:space="preserve">% </w:t>
+        <w:t>3.76-5.05)</w:t>
+      </w:r>
+      <w:r>
+        <w:t xml:space="preserve"> </w:t>
+      </w:r>
+      <w:r>
+        <w:t xml:space="preserve">of malaria cases </w:t>
       </w:r>
       <w:r>
         <w:rPr>
           <w:highlight w:val="yellow"/>
         </w:rPr>
-        <w:t xml:space="preserve"> (</w:t>
-      </w:r>
-      <w:proofErr w:type="gramEnd"/>
+        <w:t xml:space="preserve">and </w:t>
+      </w:r>
       <w:r>
         <w:rPr>
           <w:highlight w:val="yellow"/>
         </w:rPr>
-        <w:t>3.76-5.05)</w:t>
-      </w:r>
-      <w:r>
-        <w:t xml:space="preserve"> </w:t>
-      </w:r>
-      <w:r>
-        <w:t xml:space="preserve">of malaria cases </w:t>
+        <w:t>5.8%</w:t>
       </w:r>
       <w:r>
         <w:rPr>
           <w:highlight w:val="yellow"/>
         </w:rPr>
-        <w:t xml:space="preserve">and </w:t>
+        <w:t xml:space="preserve"> (3.68-12.66</w:t>
       </w:r>
       <w:r>
         <w:rPr>
           <w:highlight w:val="yellow"/>
         </w:rPr>
-        <w:t>7.90%</w:t>
+        <w:t>)</w:t>
+      </w:r>
+      <w:r>
+        <w:t xml:space="preserve"> </w:t>
+      </w:r>
+      <w:r>
+        <w:t>of all malaria deaths in this region</w:t>
+      </w:r>
+      <w:r>
+        <w:t xml:space="preserve">, but there were still </w:t>
       </w:r>
       <w:r>
         <w:rPr>
           <w:highlight w:val="yellow"/>
         </w:rPr>
-        <w:t xml:space="preserve"> 5.8%</w:t>
-      </w:r>
-      <w:r>
-        <w:rPr>
-          <w:highlight w:val="yellow"/>
-        </w:rPr>
-        <w:t xml:space="preserve"> (3.68-12.66</w:t>
-      </w:r>
-      <w:r>
-        <w:rPr>
-          <w:highlight w:val="yellow"/>
-        </w:rPr>
-        <w:t>)</w:t>
-      </w:r>
-      <w:r>
-        <w:t xml:space="preserve"> </w:t>
-      </w:r>
-      <w:r>
-        <w:t>of all malaria deaths in this region</w:t>
-      </w:r>
-      <w:r>
-        <w:t xml:space="preserve">, but there were still </w:t>
-      </w:r>
-      <w:r>
-        <w:rPr>
-          <w:highlight w:val="yellow"/>
-        </w:rPr>
-        <w:t>1.1</w:t>
-      </w:r>
-      <w:r>
-        <w:rPr>
-          <w:highlight w:val="yellow"/>
-        </w:rPr>
-        <w:t xml:space="preserve"> 1.2</w:t>
+        <w:t>1.2</w:t>
       </w:r>
       <w:r>
         <w:rPr>
@@ -7213,268 +7200,220 @@
         <w:rPr>
           <w:highlight w:val="yellow"/>
         </w:rPr>
-        <w:t xml:space="preserve">16.5 </w:t>
+        <w:t xml:space="preserve">16.3 </w:t>
       </w:r>
       <w:r>
         <w:rPr>
           <w:highlight w:val="yellow"/>
         </w:rPr>
-        <w:t xml:space="preserve">16.3 </w:t>
+        <w:t>b</w:t>
       </w:r>
       <w:r>
         <w:rPr>
           <w:highlight w:val="yellow"/>
         </w:rPr>
-        <w:t>b</w:t>
+        <w:t xml:space="preserve">illion (95% UI </w:t>
       </w:r>
       <w:r>
         <w:rPr>
           <w:highlight w:val="yellow"/>
         </w:rPr>
-        <w:t xml:space="preserve">illion (95% UI </w:t>
+        <w:t>11.2 billion</w:t>
       </w:r>
       <w:r>
         <w:rPr>
           <w:highlight w:val="yellow"/>
         </w:rPr>
-        <w:t>11.2 billion</w:t>
+        <w:t>-</w:t>
       </w:r>
       <w:r>
         <w:rPr>
           <w:highlight w:val="yellow"/>
         </w:rPr>
-        <w:t>-</w:t>
+        <w:t>22.1</w:t>
       </w:r>
       <w:r>
         <w:rPr>
           <w:highlight w:val="yellow"/>
         </w:rPr>
-        <w:t>22.1</w:t>
+        <w:t xml:space="preserve"> billion)</w:t>
+      </w:r>
+      <w:r>
+        <w:t xml:space="preserve"> cases of malaria and </w:t>
       </w:r>
       <w:r>
         <w:rPr>
           <w:highlight w:val="yellow"/>
         </w:rPr>
-        <w:t xml:space="preserve"> billion)</w:t>
-      </w:r>
-      <w:r>
-        <w:t xml:space="preserve"> cases of malaria and </w:t>
+        <w:t xml:space="preserve">40.2 </w:t>
       </w:r>
       <w:r>
         <w:rPr>
           <w:highlight w:val="yellow"/>
         </w:rPr>
-        <w:t>38.5</w:t>
+        <w:t>million (</w:t>
       </w:r>
       <w:r>
         <w:rPr>
           <w:highlight w:val="yellow"/>
         </w:rPr>
-        <w:t xml:space="preserve"> </w:t>
+        <w:t>19.</w:t>
       </w:r>
       <w:r>
         <w:rPr>
           <w:highlight w:val="yellow"/>
         </w:rPr>
-        <w:t xml:space="preserve">40.2 </w:t>
+        <w:t>4</w:t>
       </w:r>
       <w:r>
         <w:rPr>
           <w:highlight w:val="yellow"/>
         </w:rPr>
-        <w:t>million (</w:t>
+        <w:t xml:space="preserve"> -</w:t>
       </w:r>
       <w:r>
         <w:rPr>
           <w:highlight w:val="yellow"/>
         </w:rPr>
-        <w:t>19.</w:t>
+        <w:t>56.</w:t>
       </w:r>
       <w:r>
         <w:rPr>
           <w:highlight w:val="yellow"/>
         </w:rPr>
-        <w:t>4</w:t>
+        <w:t>7</w:t>
       </w:r>
       <w:r>
         <w:rPr>
           <w:highlight w:val="yellow"/>
         </w:rPr>
-        <w:t xml:space="preserve"> -</w:t>
+        <w:t xml:space="preserve"> million</w:t>
       </w:r>
       <w:r>
         <w:rPr>
           <w:highlight w:val="yellow"/>
         </w:rPr>
-        <w:t>56.</w:t>
+        <w:t>)</w:t>
+      </w:r>
+      <w:r>
+        <w:t xml:space="preserve"> malaria deaths would </w:t>
+      </w:r>
+      <w:r>
+        <w:t>occur</w:t>
+      </w:r>
+      <w:r>
+        <w:t xml:space="preserve"> </w:t>
+      </w:r>
+      <w:r>
+        <w:t xml:space="preserve">through 2050. </w:t>
+      </w:r>
+      <w:r>
+        <w:t>Under a routine vaccine scenario beginning in 2023</w:t>
+      </w:r>
+      <w:r>
+        <w:t>, we estimate that</w:t>
       </w:r>
       <w:r>
         <w:rPr>
           <w:highlight w:val="yellow"/>
         </w:rPr>
-        <w:t>7</w:t>
+        <w:t xml:space="preserve"> 621</w:t>
       </w:r>
       <w:r>
         <w:rPr>
           <w:highlight w:val="yellow"/>
         </w:rPr>
-        <w:t xml:space="preserve"> million</w:t>
+        <w:t xml:space="preserve"> million (95% UI 590 million-1.06 billion</w:t>
+      </w:r>
+      <w:r>
+        <w:t>)</w:t>
+      </w:r>
+      <w:r>
+        <w:t xml:space="preserve"> </w:t>
+      </w:r>
+      <w:r>
+        <w:t>cases of malaria and</w:t>
+      </w:r>
+      <w:r>
+        <w:t xml:space="preserve"> </w:t>
       </w:r>
       <w:r>
         <w:rPr>
           <w:highlight w:val="yellow"/>
         </w:rPr>
-        <w:t>)</w:t>
-      </w:r>
-      <w:r>
-        <w:t xml:space="preserve"> malaria deaths would </w:t>
-      </w:r>
-      <w:r>
-        <w:t>occur</w:t>
-      </w:r>
-      <w:r>
-        <w:t xml:space="preserve"> </w:t>
-      </w:r>
-      <w:r>
-        <w:t xml:space="preserve">through 2050. </w:t>
-      </w:r>
-      <w:r>
-        <w:t>Under a routine vaccine scenario beginning in 2023</w:t>
-      </w:r>
-      <w:r>
-        <w:t xml:space="preserve">, we estimate that </w:t>
+        <w:t xml:space="preserve">1.91 </w:t>
       </w:r>
       <w:r>
         <w:rPr>
           <w:highlight w:val="yellow"/>
         </w:rPr>
-        <w:t>818</w:t>
+        <w:t>million (1.33-3.55)</w:t>
+      </w:r>
+      <w:r>
+        <w:t xml:space="preserve"> malaria deaths would be prevented </w:t>
+      </w:r>
+      <w:r>
+        <w:t>through 2050.</w:t>
+      </w:r>
+      <w:r>
+        <w:t xml:space="preserve"> </w:t>
+      </w:r>
+      <w:r>
+        <w:t xml:space="preserve">These figures represent a </w:t>
       </w:r>
       <w:r>
         <w:rPr>
           <w:highlight w:val="yellow"/>
         </w:rPr>
-        <w:t xml:space="preserve"> 621</w:t>
+        <w:t>5.05% (4.69-5.57)</w:t>
       </w:r>
       <w:r>
         <w:rPr>
           <w:highlight w:val="yellow"/>
         </w:rPr>
-        <w:t xml:space="preserve"> million (95% UI 590 million-1.06 billion</w:t>
-      </w:r>
-      <w:r>
-        <w:t>)</w:t>
-      </w:r>
-      <w:r>
-        <w:t xml:space="preserve"> </w:t>
-      </w:r>
-      <w:r>
-        <w:t>cases of malaria and</w:t>
-      </w:r>
-      <w:r>
-        <w:t xml:space="preserve"> </w:t>
+        <w:t xml:space="preserve"> 3.8%</w:t>
+      </w:r>
+      <w:r>
+        <w:t xml:space="preserve"> decrease in malaria cases and </w:t>
       </w:r>
       <w:r>
         <w:rPr>
           <w:highlight w:val="yellow"/>
         </w:rPr>
-        <w:t xml:space="preserve">2.54 </w:t>
+        <w:t xml:space="preserve">a </w:t>
       </w:r>
       <w:r>
         <w:rPr>
           <w:highlight w:val="yellow"/>
         </w:rPr>
-        <w:t xml:space="preserve">1.91 </w:t>
+        <w:t>4.8%</w:t>
       </w:r>
       <w:r>
         <w:rPr>
           <w:highlight w:val="yellow"/>
         </w:rPr>
-        <w:t>million (1.33-3.55)</w:t>
-      </w:r>
-      <w:r>
-        <w:t xml:space="preserve"> malaria deaths would be prevented </w:t>
-      </w:r>
-      <w:r>
-        <w:t>through 2050.</w:t>
-      </w:r>
-      <w:r>
-        <w:t xml:space="preserve"> </w:t>
-      </w:r>
-      <w:r>
-        <w:t xml:space="preserve">These figures represent a </w:t>
+        <w:t xml:space="preserve"> (4.55-8.89)</w:t>
+      </w:r>
+      <w:r>
+        <w:t xml:space="preserve"> decrease in deaths. Through 2100, we estimate </w:t>
+      </w:r>
+      <w:r>
+        <w:t xml:space="preserve">a </w:t>
       </w:r>
       <w:r>
         <w:rPr>
           <w:highlight w:val="yellow"/>
         </w:rPr>
-        <w:t>5.05% (4.69-5.57)</w:t>
+        <w:t>3.8%</w:t>
       </w:r>
       <w:r>
         <w:rPr>
           <w:highlight w:val="yellow"/>
         </w:rPr>
-        <w:t xml:space="preserve"> 3.8%</w:t>
-      </w:r>
-      <w:r>
-        <w:t xml:space="preserve"> decrease in malaria cases and </w:t>
-      </w:r>
-      <w:r>
-        <w:rPr>
-          <w:highlight w:val="yellow"/>
-        </w:rPr>
-        <w:t>a 6.67%</w:t>
-      </w:r>
-      <w:r>
-        <w:rPr>
-          <w:highlight w:val="yellow"/>
-        </w:rPr>
-        <w:t xml:space="preserve"> 4.8%</w:t>
-      </w:r>
-      <w:r>
-        <w:rPr>
-          <w:highlight w:val="yellow"/>
-        </w:rPr>
-        <w:t xml:space="preserve"> (4.55-8.89)</w:t>
-      </w:r>
-      <w:r>
-        <w:t xml:space="preserve"> decrease in deaths. Through 2100, we estimate </w:t>
-      </w:r>
-      <w:r>
-        <w:t xml:space="preserve">a </w:t>
-      </w:r>
-      <w:r>
-        <w:rPr>
-          <w:highlight w:val="yellow"/>
-        </w:rPr>
-        <w:t>4.26%</w:t>
-      </w:r>
-      <w:r>
-        <w:rPr>
-          <w:highlight w:val="yellow"/>
-        </w:rPr>
-        <w:t xml:space="preserve"> </w:t>
-      </w:r>
-      <w:r>
-        <w:rPr>
-          <w:highlight w:val="yellow"/>
-        </w:rPr>
-        <w:t>3.8%</w:t>
-      </w:r>
-      <w:r>
-        <w:rPr>
-          <w:highlight w:val="yellow"/>
-        </w:rPr>
         <w:t xml:space="preserve"> (3.76-5.05)</w:t>
       </w:r>
       <w:r>
         <w:t xml:space="preserve"> decrease in malaria cases and a </w:t>
-      </w:r>
-      <w:r>
-        <w:rPr>
-          <w:highlight w:val="yellow"/>
-        </w:rPr>
-        <w:t xml:space="preserve">7.90% </w:t>
       </w:r>
       <w:r>
         <w:rPr>
@@ -7585,49 +7524,37 @@
         <w:rPr>
           <w:highlight w:val="yellow"/>
         </w:rPr>
-        <w:t>156,000</w:t>
+        <w:t>101,000</w:t>
       </w:r>
       <w:r>
         <w:rPr>
           <w:highlight w:val="yellow"/>
         </w:rPr>
-        <w:t xml:space="preserve"> 101,000</w:t>
+        <w:t xml:space="preserve"> cases </w:t>
       </w:r>
       <w:r>
         <w:rPr>
           <w:highlight w:val="yellow"/>
         </w:rPr>
-        <w:t xml:space="preserve"> cases (30,000-242,000) </w:t>
+        <w:t>(11,000-190,000)</w:t>
+      </w:r>
+      <w:r>
+        <w:t xml:space="preserve"> </w:t>
+      </w:r>
+      <w:r>
+        <w:t xml:space="preserve">per 100,000 fully vaccinated </w:t>
+      </w:r>
+      <w:r>
+        <w:t xml:space="preserve">people </w:t>
+      </w:r>
+      <w:r>
+        <w:t xml:space="preserve">(FVP) in countries in the first 15 years following vaccine introduction and </w:t>
       </w:r>
       <w:r>
         <w:rPr>
           <w:highlight w:val="yellow"/>
         </w:rPr>
-        <w:t>(11,000-190,000)</w:t>
-      </w:r>
-      <w:r>
-        <w:t xml:space="preserve"> </w:t>
-      </w:r>
-      <w:r>
-        <w:t xml:space="preserve">per 100,000 fully vaccinated </w:t>
-      </w:r>
-      <w:r>
-        <w:t xml:space="preserve">people </w:t>
-      </w:r>
-      <w:r>
-        <w:t xml:space="preserve">(FVP) in countries in the first 15 years following vaccine introduction and </w:t>
-      </w:r>
-      <w:r>
-        <w:rPr>
-          <w:highlight w:val="yellow"/>
-        </w:rPr>
-        <w:t xml:space="preserve">119,000 </w:t>
-      </w:r>
-      <w:r>
-        <w:rPr>
-          <w:highlight w:val="yellow"/>
-        </w:rPr>
-        <w:t xml:space="preserve">84,000 (18,000-144,000) </w:t>
+        <w:t xml:space="preserve">84,000 </w:t>
       </w:r>
       <w:r>
         <w:rPr>
@@ -8090,145 +8017,115 @@
         <w:rPr>
           <w:highlight w:val="yellow"/>
         </w:rPr>
-        <w:t>3.7</w:t>
+        <w:t xml:space="preserve">2.13 </w:t>
       </w:r>
       <w:r>
         <w:rPr>
           <w:highlight w:val="yellow"/>
         </w:rPr>
-        <w:t>9</w:t>
+        <w:t>billion cases</w:t>
       </w:r>
       <w:r>
         <w:rPr>
           <w:highlight w:val="yellow"/>
         </w:rPr>
-        <w:t xml:space="preserve"> </w:t>
+        <w:t xml:space="preserve"> (2.61-</w:t>
       </w:r>
       <w:r>
         <w:rPr>
           <w:highlight w:val="yellow"/>
         </w:rPr>
-        <w:t xml:space="preserve">2.13 </w:t>
+        <w:t>5.18</w:t>
+      </w:r>
+      <w:r>
+        <w:t>)</w:t>
+      </w:r>
+      <w:r>
+        <w:t xml:space="preserve"> w</w:t>
+      </w:r>
+      <w:r>
+        <w:t>ould be</w:t>
+      </w:r>
+      <w:r>
+        <w:t xml:space="preserve"> averted</w:t>
+      </w:r>
+      <w:r>
+        <w:t xml:space="preserve"> by </w:t>
+      </w:r>
+      <w:r>
+        <w:t xml:space="preserve">vaccines </w:t>
+      </w:r>
+      <w:r>
+        <w:t xml:space="preserve">in children under 5, in contrast to an estimated </w:t>
+      </w:r>
+      <w:r>
+        <w:t xml:space="preserve">decrease </w:t>
+      </w:r>
+      <w:r>
+        <w:t xml:space="preserve">of </w:t>
       </w:r>
       <w:r>
         <w:rPr>
           <w:highlight w:val="yellow"/>
         </w:rPr>
-        <w:t>billion cases</w:t>
+        <w:t>5.8</w:t>
       </w:r>
       <w:r>
         <w:rPr>
           <w:highlight w:val="yellow"/>
         </w:rPr>
-        <w:t xml:space="preserve"> (2.61-</w:t>
+        <w:t xml:space="preserve"> </w:t>
       </w:r>
       <w:r>
         <w:rPr>
           <w:highlight w:val="yellow"/>
         </w:rPr>
-        <w:t>5.18</w:t>
-      </w:r>
-      <w:r>
-        <w:t>)</w:t>
-      </w:r>
-      <w:r>
-        <w:t xml:space="preserve"> w</w:t>
-      </w:r>
-      <w:r>
-        <w:t>ould be</w:t>
-      </w:r>
-      <w:r>
-        <w:t xml:space="preserve"> averted</w:t>
-      </w:r>
-      <w:r>
-        <w:t xml:space="preserve"> by </w:t>
-      </w:r>
-      <w:r>
-        <w:t xml:space="preserve">vaccines </w:t>
-      </w:r>
-      <w:r>
-        <w:t xml:space="preserve">in children under 5, in contrast to an estimated </w:t>
-      </w:r>
-      <w:r>
-        <w:t xml:space="preserve">decrease </w:t>
-      </w:r>
-      <w:r>
-        <w:t xml:space="preserve">of </w:t>
+        <w:t>m</w:t>
       </w:r>
       <w:r>
         <w:rPr>
           <w:highlight w:val="yellow"/>
         </w:rPr>
-        <w:t>767</w:t>
+        <w:t>illion</w:t>
       </w:r>
       <w:r>
         <w:rPr>
           <w:highlight w:val="yellow"/>
         </w:rPr>
-        <w:t xml:space="preserve"> 5.8</w:t>
+        <w:t xml:space="preserve"> cases</w:t>
       </w:r>
       <w:r>
         <w:rPr>
           <w:highlight w:val="yellow"/>
         </w:rPr>
-        <w:t xml:space="preserve"> </w:t>
+        <w:t xml:space="preserve"> (124-</w:t>
       </w:r>
       <w:r>
         <w:rPr>
           <w:highlight w:val="yellow"/>
         </w:rPr>
-        <w:t>m</w:t>
+        <w:t>228)</w:t>
+      </w:r>
+      <w:r>
+        <w:t xml:space="preserve"> in children between 5 and 15 and </w:t>
+      </w:r>
+      <w:r>
+        <w:t>an increase of</w:t>
+      </w:r>
+      <w:r>
+        <w:t xml:space="preserve"> </w:t>
       </w:r>
       <w:r>
         <w:rPr>
           <w:highlight w:val="yellow"/>
         </w:rPr>
-        <w:t>illion</w:t>
+        <w:t>1.01</w:t>
       </w:r>
       <w:r>
         <w:rPr>
           <w:highlight w:val="yellow"/>
         </w:rPr>
-        <w:t xml:space="preserve"> cases</w:t>
-      </w:r>
-      <w:r>
-        <w:rPr>
-          <w:highlight w:val="yellow"/>
-        </w:rPr>
-        <w:t xml:space="preserve"> (124-</w:t>
-      </w:r>
-      <w:r>
-        <w:rPr>
-          <w:highlight w:val="yellow"/>
-        </w:rPr>
-        <w:t>228)</w:t>
-      </w:r>
-      <w:r>
-        <w:t xml:space="preserve"> in children between 5 and 15 and </w:t>
-      </w:r>
-      <w:r>
-        <w:t>an increase of</w:t>
-      </w:r>
-      <w:r>
-        <w:t xml:space="preserve"> </w:t>
-      </w:r>
-      <w:r>
-        <w:rPr>
-          <w:highlight w:val="yellow"/>
-        </w:rPr>
-        <w:t xml:space="preserve">1.01 </w:t>
-      </w:r>
-      <w:r>
-        <w:rPr>
-          <w:highlight w:val="yellow"/>
-        </w:rPr>
-        <w:t xml:space="preserve">439 </w:t>
-      </w:r>
-      <w:r>
-        <w:rPr>
-          <w:highlight w:val="yellow"/>
-        </w:rPr>
-        <w:t xml:space="preserve">million </w:t>
+        <w:t xml:space="preserve"> </w:t>
       </w:r>
       <w:r>
         <w:rPr>
@@ -8274,112 +8171,79 @@
         <w:rPr>
           <w:highlight w:val="yellow"/>
         </w:rPr>
-        <w:t xml:space="preserve">13.1 </w:t>
+        <w:t xml:space="preserve">9.4 </w:t>
       </w:r>
       <w:r>
         <w:rPr>
           <w:highlight w:val="yellow"/>
         </w:rPr>
-        <w:t xml:space="preserve">9.4 </w:t>
+        <w:t>million</w:t>
       </w:r>
       <w:r>
         <w:rPr>
           <w:highlight w:val="yellow"/>
         </w:rPr>
-        <w:t>million</w:t>
+        <w:t xml:space="preserve"> (</w:t>
       </w:r>
       <w:r>
         <w:rPr>
           <w:highlight w:val="yellow"/>
         </w:rPr>
-        <w:t xml:space="preserve"> (</w:t>
+        <w:t>762,000-18.3 million)</w:t>
+      </w:r>
+      <w:r>
+        <w:t xml:space="preserve"> deaths were averted in children under 5, in contrast to an estimated increase of</w:t>
+      </w:r>
+      <w:r>
+        <w:t xml:space="preserve"> </w:t>
       </w:r>
       <w:r>
         <w:rPr>
           <w:highlight w:val="yellow"/>
         </w:rPr>
-        <w:t>762,000-18.3 million)</w:t>
-      </w:r>
-      <w:r>
-        <w:t xml:space="preserve"> deaths were averted in children under 5, in contrast to an estimated increase of</w:t>
-      </w:r>
-      <w:r>
-        <w:t xml:space="preserve"> </w:t>
-      </w:r>
-      <w:r>
-        <w:t>4</w:t>
+        <w:t xml:space="preserve">2.8 </w:t>
       </w:r>
       <w:r>
         <w:rPr>
           <w:highlight w:val="yellow"/>
         </w:rPr>
-        <w:t>.54</w:t>
+        <w:t xml:space="preserve">million </w:t>
       </w:r>
       <w:r>
         <w:rPr>
           <w:highlight w:val="yellow"/>
         </w:rPr>
-        <w:t xml:space="preserve"> </w:t>
+        <w:t>(</w:t>
       </w:r>
       <w:r>
         <w:rPr>
           <w:highlight w:val="yellow"/>
         </w:rPr>
-        <w:t xml:space="preserve">2.8 </w:t>
+        <w:t>2.01</w:t>
       </w:r>
       <w:r>
         <w:rPr>
           <w:highlight w:val="yellow"/>
         </w:rPr>
-        <w:t xml:space="preserve">million </w:t>
+        <w:t>-</w:t>
       </w:r>
       <w:r>
         <w:rPr>
           <w:highlight w:val="yellow"/>
         </w:rPr>
-        <w:t>(</w:t>
+        <w:t xml:space="preserve"> 7.39)</w:t>
+      </w:r>
+      <w:r>
+        <w:t xml:space="preserve"> </w:t>
+      </w:r>
+      <w:r>
+        <w:t xml:space="preserve">deaths in children between 5 and 15 </w:t>
       </w:r>
       <w:r>
         <w:rPr>
           <w:highlight w:val="yellow"/>
         </w:rPr>
-        <w:t>2.01</w:t>
-      </w:r>
-      <w:r>
-        <w:rPr>
-          <w:highlight w:val="yellow"/>
-        </w:rPr>
-        <w:t>-</w:t>
-      </w:r>
-      <w:r>
-        <w:rPr>
-          <w:highlight w:val="yellow"/>
-        </w:rPr>
-        <w:t xml:space="preserve"> 7.39)</w:t>
-      </w:r>
-      <w:r>
-        <w:t xml:space="preserve"> </w:t>
-      </w:r>
-      <w:r>
-        <w:t xml:space="preserve">deaths in children between 5 and 15 </w:t>
-      </w:r>
-      <w:r>
-        <w:rPr>
-          <w:highlight w:val="yellow"/>
-        </w:rPr>
-        <w:t>and 9</w:t>
-      </w:r>
-      <w:r>
-        <w:rPr>
-          <w:highlight w:val="yellow"/>
-        </w:rPr>
-        <w:t>65</w:t>
-      </w:r>
-      <w:r>
-        <w:rPr>
-          <w:highlight w:val="yellow"/>
-        </w:rPr>
-        <w:t xml:space="preserve">,000 </w:t>
+        <w:t xml:space="preserve">and </w:t>
       </w:r>
       <w:r>
         <w:rPr>
@@ -8443,29 +8307,7 @@
         <w:t xml:space="preserve">). </w:t>
       </w:r>
       <w:r>
-        <w:t>Impact is also influenced by</w:t>
-      </w:r>
-      <w:commentRangeStart w:id="1"/>
-      <w:commentRangeStart w:id="2"/>
-      <w:r>
-        <w:t xml:space="preserve"> changing population structure </w:t>
-      </w:r>
-      <w:commentRangeEnd w:id="1"/>
-      <w:r>
-        <w:rPr>
-          <w:rStyle w:val="CommentReference"/>
-        </w:rPr>
-        <w:commentReference w:id="1"/>
-      </w:r>
-      <w:commentRangeEnd w:id="2"/>
-      <w:r>
-        <w:rPr>
-          <w:rStyle w:val="CommentReference"/>
-        </w:rPr>
-        <w:commentReference w:id="2"/>
-      </w:r>
-      <w:r>
-        <w:t>over the simulation period (</w:t>
+        <w:t>Impact is also influenced by changing population structure over the simulation period (</w:t>
       </w:r>
       <w:r>
         <w:rPr>
@@ -8731,7 +8573,6 @@
           <w:bCs/>
           <w:lang w:val="en-US"/>
         </w:rPr>
-        <w:lastRenderedPageBreak/>
         <w:t>Discussion</w:t>
       </w:r>
     </w:p>
@@ -8745,6 +8586,7 @@
         <w:rPr>
           <w:lang w:val="en-US"/>
         </w:rPr>
+        <w:lastRenderedPageBreak/>
         <w:t xml:space="preserve">Our results demonstrate a large impact of </w:t>
       </w:r>
       <w:r>
@@ -11086,7 +10928,6 @@
         <w:pStyle w:val="Bibliography"/>
       </w:pPr>
       <w:r>
-        <w:lastRenderedPageBreak/>
         <w:t>19.</w:t>
       </w:r>
       <w:r>
@@ -11385,7 +11226,6 @@
         <w:pStyle w:val="Bibliography"/>
       </w:pPr>
       <w:r>
-        <w:lastRenderedPageBreak/>
         <w:t>28.</w:t>
       </w:r>
       <w:r>
@@ -11728,7 +11568,6 @@
         <w:pStyle w:val="Bibliography"/>
       </w:pPr>
       <w:r>
-        <w:lastRenderedPageBreak/>
         <w:t>39.</w:t>
       </w:r>
       <w:r>
@@ -12033,7 +11872,6 @@
         <w:pStyle w:val="Bibliography"/>
       </w:pPr>
       <w:r>
-        <w:lastRenderedPageBreak/>
         <w:t>51.</w:t>
       </w:r>
       <w:r>
@@ -12216,8 +12054,8 @@
       </w:pPr>
     </w:p>
     <w:sectPr>
-      <w:headerReference w:type="default" r:id="rId15"/>
-      <w:footerReference w:type="default" r:id="rId16"/>
+      <w:headerReference w:type="default" r:id="rId11"/>
+      <w:footerReference w:type="default" r:id="rId12"/>
       <w:pgSz w:w="11906" w:h="16838"/>
       <w:pgMar w:top="1440" w:right="1440" w:bottom="1440" w:left="1440" w:header="708" w:footer="708" w:gutter="0"/>
       <w:cols w:space="708"/>
@@ -12225,64 +12063,6 @@
     </w:sectPr>
   </w:body>
 </w:document>
-</file>
-
-<file path=word/comments.xml><?xml version="1.0" encoding="utf-8"?>
-<w:comments xmlns:wpc="http://schemas.microsoft.com/office/word/2010/wordprocessingCanvas" xmlns:cx="http://schemas.microsoft.com/office/drawing/2014/chartex" xmlns:cx1="http://schemas.microsoft.com/office/drawing/2015/9/8/chartex" xmlns:cx2="http://schemas.microsoft.com/office/drawing/2015/10/21/chartex" xmlns:cx3="http://schemas.microsoft.com/office/drawing/2016/5/9/chartex" xmlns:cx4="http://schemas.microsoft.com/office/drawing/2016/5/10/chartex" xmlns:cx5="http://schemas.microsoft.com/office/drawing/2016/5/11/chartex" xmlns:cx6="http://schemas.microsoft.com/office/drawing/2016/5/12/chartex" xmlns:cx7="http://schemas.microsoft.com/office/drawing/2016/5/13/chartex" xmlns:cx8="http://schemas.microsoft.com/office/drawing/2016/5/14/chartex" xmlns:mc="http://schemas.openxmlformats.org/markup-compatibility/2006" xmlns:aink="http://schemas.microsoft.com/office/drawing/2016/ink" xmlns:am3d="http://schemas.microsoft.com/office/drawing/2017/model3d" xmlns:o="urn:schemas-microsoft-com:office:office" xmlns:oel="http://schemas.microsoft.com/office/2019/extlst" xmlns:r="http://schemas.openxmlformats.org/officeDocument/2006/relationships" xmlns:m="http://schemas.openxmlformats.org/officeDocument/2006/math" xmlns:v="urn:schemas-microsoft-com:vml" xmlns:wp14="http://schemas.microsoft.com/office/word/2010/wordprocessingDrawing" xmlns:wp="http://schemas.openxmlformats.org/drawingml/2006/wordprocessingDrawing" xmlns:w10="urn:schemas-microsoft-com:office:word" xmlns:w="http://schemas.openxmlformats.org/wordprocessingml/2006/main" xmlns:w14="http://schemas.microsoft.com/office/word/2010/wordml" xmlns:w15="http://schemas.microsoft.com/office/word/2012/wordml" xmlns:w16cex="http://schemas.microsoft.com/office/word/2018/wordml/cex" xmlns:w16cid="http://schemas.microsoft.com/office/word/2016/wordml/cid" xmlns:w16="http://schemas.microsoft.com/office/word/2018/wordml" xmlns:w16du="http://schemas.microsoft.com/office/word/2023/wordml/word16du" xmlns:w16sdtdh="http://schemas.microsoft.com/office/word/2020/wordml/sdtdatahash" xmlns:w16sdtfl="http://schemas.microsoft.com/office/word/2024/wordml/sdtformatlock" xmlns:w16se="http://schemas.microsoft.com/office/word/2015/wordml/symex" xmlns:wpg="http://schemas.microsoft.com/office/word/2010/wordprocessingGroup" xmlns:wpi="http://schemas.microsoft.com/office/word/2010/wordprocessingInk" xmlns:wne="http://schemas.microsoft.com/office/word/2006/wordml" xmlns:wps="http://schemas.microsoft.com/office/word/2010/wordprocessingShape" mc:Ignorable="w14 w15 w16se w16cid w16 w16cex w16sdtdh w16sdtfl w16du wp14">
-  <w:comment w:id="1" w:author="Schmit, Nora" w:date="2025-01-16T13:55:00Z" w:initials="SN">
-    <w:p>
-      <w:pPr>
-        <w:pStyle w:val="CommentText"/>
-      </w:pPr>
-      <w:r>
-        <w:rPr>
-          <w:rStyle w:val="CommentReference"/>
-        </w:rPr>
-        <w:annotationRef/>
-      </w:r>
-      <w:r>
-        <w:t>So you are saying the reason the impact declines over time is a. because rebound takes a while to occur, and b. because of changes in the population structure? I think it would be good to show the actual influence of demography on this here in the main manuscript if the effect is substantial - because Figure 3 does not fully reflect the magnitude in change over time for cases that we see in Figure 1. A panel figure of the 2 contributing factors would be nice!</w:t>
-      </w:r>
-    </w:p>
-  </w:comment>
-  <w:comment w:id="2" w:author="Haile, Lydia M" w:date="2025-02-05T11:33:00Z" w:initials="LH">
-    <w:p>
-      <w:pPr>
-        <w:pStyle w:val="CommentText"/>
-      </w:pPr>
-      <w:r>
-        <w:rPr>
-          <w:rStyle w:val="CommentReference"/>
-        </w:rPr>
-        <w:annotationRef/>
-      </w:r>
-      <w:r>
-        <w:t>Good point Nora! Pete suggested a sensitivity analysis on the impact of changing age structure which I’m working on-- will keep this comment open until that is done</w:t>
-      </w:r>
-    </w:p>
-  </w:comment>
-</w:comments>
-</file>
-
-<file path=word/commentsExtended.xml><?xml version="1.0" encoding="utf-8"?>
-<w15:commentsEx xmlns:wpc="http://schemas.microsoft.com/office/word/2010/wordprocessingCanvas" xmlns:cx="http://schemas.microsoft.com/office/drawing/2014/chartex" xmlns:cx1="http://schemas.microsoft.com/office/drawing/2015/9/8/chartex" xmlns:cx2="http://schemas.microsoft.com/office/drawing/2015/10/21/chartex" xmlns:cx3="http://schemas.microsoft.com/office/drawing/2016/5/9/chartex" xmlns:cx4="http://schemas.microsoft.com/office/drawing/2016/5/10/chartex" xmlns:cx5="http://schemas.microsoft.com/office/drawing/2016/5/11/chartex" xmlns:cx6="http://schemas.microsoft.com/office/drawing/2016/5/12/chartex" xmlns:cx7="http://schemas.microsoft.com/office/drawing/2016/5/13/chartex" xmlns:cx8="http://schemas.microsoft.com/office/drawing/2016/5/14/chartex" xmlns:mc="http://schemas.openxmlformats.org/markup-compatibility/2006" xmlns:aink="http://schemas.microsoft.com/office/drawing/2016/ink" xmlns:am3d="http://schemas.microsoft.com/office/drawing/2017/model3d" xmlns:o="urn:schemas-microsoft-com:office:office" xmlns:oel="http://schemas.microsoft.com/office/2019/extlst" xmlns:r="http://schemas.openxmlformats.org/officeDocument/2006/relationships" xmlns:m="http://schemas.openxmlformats.org/officeDocument/2006/math" xmlns:v="urn:schemas-microsoft-com:vml" xmlns:wp14="http://schemas.microsoft.com/office/word/2010/wordprocessingDrawing" xmlns:wp="http://schemas.openxmlformats.org/drawingml/2006/wordprocessingDrawing" xmlns:w10="urn:schemas-microsoft-com:office:word" xmlns:w="http://schemas.openxmlformats.org/wordprocessingml/2006/main" xmlns:w14="http://schemas.microsoft.com/office/word/2010/wordml" xmlns:w15="http://schemas.microsoft.com/office/word/2012/wordml" xmlns:w16cex="http://schemas.microsoft.com/office/word/2018/wordml/cex" xmlns:w16cid="http://schemas.microsoft.com/office/word/2016/wordml/cid" xmlns:w16="http://schemas.microsoft.com/office/word/2018/wordml" xmlns:w16du="http://schemas.microsoft.com/office/word/2023/wordml/word16du" xmlns:w16sdtdh="http://schemas.microsoft.com/office/word/2020/wordml/sdtdatahash" xmlns:w16sdtfl="http://schemas.microsoft.com/office/word/2024/wordml/sdtformatlock" xmlns:w16se="http://schemas.microsoft.com/office/word/2015/wordml/symex" xmlns:wpg="http://schemas.microsoft.com/office/word/2010/wordprocessingGroup" xmlns:wpi="http://schemas.microsoft.com/office/word/2010/wordprocessingInk" xmlns:wne="http://schemas.microsoft.com/office/word/2006/wordml" xmlns:wps="http://schemas.microsoft.com/office/word/2010/wordprocessingShape" mc:Ignorable="w14 w15 w16se w16cid w16 w16cex w16sdtdh w16sdtfl w16du wp14">
-  <w15:commentEx w15:paraId="6E7FC88D" w15:done="0"/>
-  <w15:commentEx w15:paraId="3B609D4D" w15:paraIdParent="6E7FC88D" w15:done="0"/>
-</w15:commentsEx>
-</file>
-
-<file path=word/commentsExtensible.xml><?xml version="1.0" encoding="utf-8"?>
-<w16cex:commentsExtensible xmlns:wpc="http://schemas.microsoft.com/office/word/2010/wordprocessingCanvas" xmlns:cx="http://schemas.microsoft.com/office/drawing/2014/chartex" xmlns:cx1="http://schemas.microsoft.com/office/drawing/2015/9/8/chartex" xmlns:cx2="http://schemas.microsoft.com/office/drawing/2015/10/21/chartex" xmlns:cx3="http://schemas.microsoft.com/office/drawing/2016/5/9/chartex" xmlns:cx4="http://schemas.microsoft.com/office/drawing/2016/5/10/chartex" xmlns:cx5="http://schemas.microsoft.com/office/drawing/2016/5/11/chartex" xmlns:cx6="http://schemas.microsoft.com/office/drawing/2016/5/12/chartex" xmlns:cx7="http://schemas.microsoft.com/office/drawing/2016/5/13/chartex" xmlns:cx8="http://schemas.microsoft.com/office/drawing/2016/5/14/chartex" xmlns:cr="http://schemas.microsoft.com/office/comments/2020/reactions" xmlns:mc="http://schemas.openxmlformats.org/markup-compatibility/2006" xmlns:aink="http://schemas.microsoft.com/office/drawing/2016/ink" xmlns:am3d="http://schemas.microsoft.com/office/drawing/2017/model3d" xmlns:o="urn:schemas-microsoft-com:office:office" xmlns:oel="http://schemas.microsoft.com/office/2019/extlst" xmlns:r="http://schemas.openxmlformats.org/officeDocument/2006/relationships" xmlns:m="http://schemas.openxmlformats.org/officeDocument/2006/math" xmlns:v="urn:schemas-microsoft-com:vml" xmlns:wp14="http://schemas.microsoft.com/office/word/2010/wordprocessingDrawing" xmlns:wp="http://schemas.openxmlformats.org/drawingml/2006/wordprocessingDrawing" xmlns:w10="urn:schemas-microsoft-com:office:word" xmlns:w="http://schemas.openxmlformats.org/wordprocessingml/2006/main" xmlns:w14="http://schemas.microsoft.com/office/word/2010/wordml" xmlns:w15="http://schemas.microsoft.com/office/word/2012/wordml" xmlns:w16cex="http://schemas.microsoft.com/office/word/2018/wordml/cex" xmlns:w16cid="http://schemas.microsoft.com/office/word/2016/wordml/cid" xmlns:w16="http://schemas.microsoft.com/office/word/2018/wordml" xmlns:w16du="http://schemas.microsoft.com/office/word/2023/wordml/word16du" xmlns:w16sdtdh="http://schemas.microsoft.com/office/word/2020/wordml/sdtdatahash" xmlns:w16sdtfl="http://schemas.microsoft.com/office/word/2024/wordml/sdtformatlock" xmlns:w16se="http://schemas.microsoft.com/office/word/2015/wordml/symex" xmlns:wpg="http://schemas.microsoft.com/office/word/2010/wordprocessingGroup" xmlns:wpi="http://schemas.microsoft.com/office/word/2010/wordprocessingInk" xmlns:wne="http://schemas.microsoft.com/office/word/2006/wordml" xmlns:wps="http://schemas.microsoft.com/office/word/2010/wordprocessingShape" mc:Ignorable="w14 w15 w16se w16cid w16 w16cex w16sdtdh w16sdtfl cr w16du wp14">
-  <w16cex:commentExtensible w16cex:durableId="54F9919A" w16cex:dateUtc="2025-01-16T13:55:00Z"/>
-  <w16cex:commentExtensible w16cex:durableId="42BBE18C" w16cex:dateUtc="2025-02-05T11:33:00Z"/>
-</w16cex:commentsExtensible>
-</file>
-
-<file path=word/commentsIds.xml><?xml version="1.0" encoding="utf-8"?>
-<w16cid:commentsIds xmlns:wpc="http://schemas.microsoft.com/office/word/2010/wordprocessingCanvas" xmlns:cx="http://schemas.microsoft.com/office/drawing/2014/chartex" xmlns:cx1="http://schemas.microsoft.com/office/drawing/2015/9/8/chartex" xmlns:cx2="http://schemas.microsoft.com/office/drawing/2015/10/21/chartex" xmlns:cx3="http://schemas.microsoft.com/office/drawing/2016/5/9/chartex" xmlns:cx4="http://schemas.microsoft.com/office/drawing/2016/5/10/chartex" xmlns:cx5="http://schemas.microsoft.com/office/drawing/2016/5/11/chartex" xmlns:cx6="http://schemas.microsoft.com/office/drawing/2016/5/12/chartex" xmlns:cx7="http://schemas.microsoft.com/office/drawing/2016/5/13/chartex" xmlns:cx8="http://schemas.microsoft.com/office/drawing/2016/5/14/chartex" xmlns:mc="http://schemas.openxmlformats.org/markup-compatibility/2006" xmlns:aink="http://schemas.microsoft.com/office/drawing/2016/ink" xmlns:am3d="http://schemas.microsoft.com/office/drawing/2017/model3d" xmlns:o="urn:schemas-microsoft-com:office:office" xmlns:oel="http://schemas.microsoft.com/office/2019/extlst" xmlns:r="http://schemas.openxmlformats.org/officeDocument/2006/relationships" xmlns:m="http://schemas.openxmlformats.org/officeDocument/2006/math" xmlns:v="urn:schemas-microsoft-com:vml" xmlns:wp14="http://schemas.microsoft.com/office/word/2010/wordprocessingDrawing" xmlns:wp="http://schemas.openxmlformats.org/drawingml/2006/wordprocessingDrawing" xmlns:w10="urn:schemas-microsoft-com:office:word" xmlns:w="http://schemas.openxmlformats.org/wordprocessingml/2006/main" xmlns:w14="http://schemas.microsoft.com/office/word/2010/wordml" xmlns:w15="http://schemas.microsoft.com/office/word/2012/wordml" xmlns:w16cex="http://schemas.microsoft.com/office/word/2018/wordml/cex" xmlns:w16cid="http://schemas.microsoft.com/office/word/2016/wordml/cid" xmlns:w16="http://schemas.microsoft.com/office/word/2018/wordml" xmlns:w16du="http://schemas.microsoft.com/office/word/2023/wordml/word16du" xmlns:w16sdtdh="http://schemas.microsoft.com/office/word/2020/wordml/sdtdatahash" xmlns:w16sdtfl="http://schemas.microsoft.com/office/word/2024/wordml/sdtformatlock" xmlns:w16se="http://schemas.microsoft.com/office/word/2015/wordml/symex" xmlns:wpg="http://schemas.microsoft.com/office/word/2010/wordprocessingGroup" xmlns:wpi="http://schemas.microsoft.com/office/word/2010/wordprocessingInk" xmlns:wne="http://schemas.microsoft.com/office/word/2006/wordml" xmlns:wps="http://schemas.microsoft.com/office/word/2010/wordprocessingShape" mc:Ignorable="w14 w15 w16se w16cid w16 w16cex w16sdtdh w16sdtfl w16du wp14">
-  <w16cid:commentId w16cid:paraId="6E7FC88D" w16cid:durableId="54F9919A"/>
-  <w16cid:commentId w16cid:paraId="3B609D4D" w16cid:durableId="42BBE18C"/>
-</w16cid:commentsIds>
 </file>
 
 <file path=word/endnotes.xml><?xml version="1.0" encoding="utf-8"?>
@@ -13136,17 +12916,6 @@
     <w:abstractNumId w:val="0"/>
   </w:num>
 </w:numbering>
-</file>
-
-<file path=word/people.xml><?xml version="1.0" encoding="utf-8"?>
-<w15:people xmlns:wpc="http://schemas.microsoft.com/office/word/2010/wordprocessingCanvas" xmlns:cx="http://schemas.microsoft.com/office/drawing/2014/chartex" xmlns:cx1="http://schemas.microsoft.com/office/drawing/2015/9/8/chartex" xmlns:cx2="http://schemas.microsoft.com/office/drawing/2015/10/21/chartex" xmlns:cx3="http://schemas.microsoft.com/office/drawing/2016/5/9/chartex" xmlns:cx4="http://schemas.microsoft.com/office/drawing/2016/5/10/chartex" xmlns:cx5="http://schemas.microsoft.com/office/drawing/2016/5/11/chartex" xmlns:cx6="http://schemas.microsoft.com/office/drawing/2016/5/12/chartex" xmlns:cx7="http://schemas.microsoft.com/office/drawing/2016/5/13/chartex" xmlns:cx8="http://schemas.microsoft.com/office/drawing/2016/5/14/chartex" xmlns:mc="http://schemas.openxmlformats.org/markup-compatibility/2006" xmlns:aink="http://schemas.microsoft.com/office/drawing/2016/ink" xmlns:am3d="http://schemas.microsoft.com/office/drawing/2017/model3d" xmlns:o="urn:schemas-microsoft-com:office:office" xmlns:oel="http://schemas.microsoft.com/office/2019/extlst" xmlns:r="http://schemas.openxmlformats.org/officeDocument/2006/relationships" xmlns:m="http://schemas.openxmlformats.org/officeDocument/2006/math" xmlns:v="urn:schemas-microsoft-com:vml" xmlns:wp14="http://schemas.microsoft.com/office/word/2010/wordprocessingDrawing" xmlns:wp="http://schemas.openxmlformats.org/drawingml/2006/wordprocessingDrawing" xmlns:w10="urn:schemas-microsoft-com:office:word" xmlns:w="http://schemas.openxmlformats.org/wordprocessingml/2006/main" xmlns:w14="http://schemas.microsoft.com/office/word/2010/wordml" xmlns:w15="http://schemas.microsoft.com/office/word/2012/wordml" xmlns:w16cex="http://schemas.microsoft.com/office/word/2018/wordml/cex" xmlns:w16cid="http://schemas.microsoft.com/office/word/2016/wordml/cid" xmlns:w16="http://schemas.microsoft.com/office/word/2018/wordml" xmlns:w16du="http://schemas.microsoft.com/office/word/2023/wordml/word16du" xmlns:w16sdtdh="http://schemas.microsoft.com/office/word/2020/wordml/sdtdatahash" xmlns:w16sdtfl="http://schemas.microsoft.com/office/word/2024/wordml/sdtformatlock" xmlns:w16se="http://schemas.microsoft.com/office/word/2015/wordml/symex" xmlns:wpg="http://schemas.microsoft.com/office/word/2010/wordprocessingGroup" xmlns:wpi="http://schemas.microsoft.com/office/word/2010/wordprocessingInk" xmlns:wne="http://schemas.microsoft.com/office/word/2006/wordml" xmlns:wps="http://schemas.microsoft.com/office/word/2010/wordprocessingShape" mc:Ignorable="w14 w15 w16se w16cid w16 w16cex w16sdtdh w16sdtfl w16du wp14">
-  <w15:person w15:author="Schmit, Nora">
-    <w15:presenceInfo w15:providerId="AD" w15:userId="S::ns6416@ic.ac.uk::50e1967d-88a3-4907-86ef-5a34669123b1"/>
-  </w15:person>
-  <w15:person w15:author="Haile, Lydia M">
-    <w15:presenceInfo w15:providerId="AD" w15:userId="S::lhaile@ic.ac.uk::78129c5c-6b21-4bca-80db-b7a66227aa31"/>
-  </w15:person>
-</w15:people>
 </file>
 
 <file path=word/styles.xml><?xml version="1.0" encoding="utf-8"?>

</xml_diff>